<commit_message>
added Ai chatbot searches
</commit_message>
<xml_diff>
--- a/data definitions, AI searches and job postings.docx
+++ b/data definitions, AI searches and job postings.docx
@@ -582,7 +582,43 @@
           <w:kern w:val="0"/>
           <w14:ligatures w14:val="none"/>
         </w:rPr>
-        <w:t>Trend in ChatGPT Interest</w:t>
+        <w:t xml:space="preserve">Trend in </w:t>
+      </w:r>
+      <w:r>
+        <w:rPr>
+          <w:rFonts w:ascii="Times New Roman" w:eastAsia="Times New Roman" w:hAnsi="Times New Roman" w:cs="Times New Roman"/>
+          <w:color w:val="000000"/>
+          <w:kern w:val="0"/>
+          <w14:ligatures w14:val="none"/>
+        </w:rPr>
+        <w:t>“</w:t>
+      </w:r>
+      <w:r>
+        <w:rPr>
+          <w:rFonts w:ascii="Times New Roman" w:eastAsia="Times New Roman" w:hAnsi="Times New Roman" w:cs="Times New Roman"/>
+          <w:color w:val="000000"/>
+          <w:kern w:val="0"/>
+          <w14:ligatures w14:val="none"/>
+        </w:rPr>
+        <w:t>ChatGPT</w:t>
+      </w:r>
+      <w:r>
+        <w:rPr>
+          <w:rFonts w:ascii="Times New Roman" w:eastAsia="Times New Roman" w:hAnsi="Times New Roman" w:cs="Times New Roman"/>
+          <w:color w:val="000000"/>
+          <w:kern w:val="0"/>
+          <w14:ligatures w14:val="none"/>
+        </w:rPr>
+        <w:t>”</w:t>
+      </w:r>
+      <w:r>
+        <w:rPr>
+          <w:rFonts w:ascii="Times New Roman" w:eastAsia="Times New Roman" w:hAnsi="Times New Roman" w:cs="Times New Roman"/>
+          <w:color w:val="000000"/>
+          <w:kern w:val="0"/>
+          <w14:ligatures w14:val="none"/>
+        </w:rPr>
+        <w:t xml:space="preserve"> Interest</w:t>
       </w:r>
     </w:p>
     <w:tbl>
@@ -720,6 +756,223 @@
               <w:t>chatgpt</w:t>
             </w:r>
             <w:proofErr w:type="spellEnd"/>
+          </w:p>
+        </w:tc>
+        <w:tc>
+          <w:tcPr>
+            <w:tcW w:w="7015" w:type="dxa"/>
+          </w:tcPr>
+          <w:p>
+            <w:pPr>
+              <w:rPr>
+                <w:rFonts w:ascii="Times New Roman" w:eastAsia="Times New Roman" w:hAnsi="Times New Roman" w:cs="Times New Roman"/>
+                <w:color w:val="000000"/>
+                <w:kern w:val="0"/>
+                <w14:ligatures w14:val="none"/>
+              </w:rPr>
+            </w:pPr>
+            <w:r>
+              <w:rPr>
+                <w:rFonts w:ascii="Times New Roman" w:eastAsia="Times New Roman" w:hAnsi="Times New Roman" w:cs="Times New Roman"/>
+                <w:color w:val="000000"/>
+                <w:kern w:val="0"/>
+                <w14:ligatures w14:val="none"/>
+              </w:rPr>
+              <w:t>0 – 100, where 100 signifies the peak interest for the time period</w:t>
+            </w:r>
+          </w:p>
+        </w:tc>
+      </w:tr>
+    </w:tbl>
+    <w:p>
+      <w:pPr>
+        <w:rPr>
+          <w:rFonts w:ascii="Times New Roman" w:eastAsia="Times New Roman" w:hAnsi="Times New Roman" w:cs="Times New Roman"/>
+          <w:color w:val="000000"/>
+          <w:kern w:val="0"/>
+          <w14:ligatures w14:val="none"/>
+        </w:rPr>
+      </w:pPr>
+    </w:p>
+    <w:p>
+      <w:pPr>
+        <w:rPr>
+          <w:rFonts w:ascii="Times New Roman" w:eastAsia="Times New Roman" w:hAnsi="Times New Roman" w:cs="Times New Roman"/>
+          <w:color w:val="000000"/>
+          <w:kern w:val="0"/>
+          <w14:ligatures w14:val="none"/>
+        </w:rPr>
+      </w:pPr>
+      <w:r>
+        <w:rPr>
+          <w:rFonts w:ascii="Times New Roman" w:eastAsia="Times New Roman" w:hAnsi="Times New Roman" w:cs="Times New Roman"/>
+          <w:color w:val="000000"/>
+          <w:kern w:val="0"/>
+          <w14:ligatures w14:val="none"/>
+        </w:rPr>
+        <w:t xml:space="preserve">Trend in </w:t>
+      </w:r>
+      <w:r>
+        <w:rPr>
+          <w:rFonts w:ascii="Times New Roman" w:eastAsia="Times New Roman" w:hAnsi="Times New Roman" w:cs="Times New Roman"/>
+          <w:color w:val="000000"/>
+          <w:kern w:val="0"/>
+          <w14:ligatures w14:val="none"/>
+        </w:rPr>
+        <w:t>“AI chatbot”</w:t>
+      </w:r>
+      <w:r>
+        <w:rPr>
+          <w:rFonts w:ascii="Times New Roman" w:eastAsia="Times New Roman" w:hAnsi="Times New Roman" w:cs="Times New Roman"/>
+          <w:color w:val="000000"/>
+          <w:kern w:val="0"/>
+          <w14:ligatures w14:val="none"/>
+        </w:rPr>
+        <w:t xml:space="preserve"> Interest</w:t>
+      </w:r>
+    </w:p>
+    <w:tbl>
+      <w:tblPr>
+        <w:tblStyle w:val="TableGrid"/>
+        <w:tblW w:w="0" w:type="auto"/>
+        <w:tblLook w:val="04A0" w:firstRow="1" w:lastRow="0" w:firstColumn="1" w:lastColumn="0" w:noHBand="0" w:noVBand="1"/>
+      </w:tblPr>
+      <w:tblGrid>
+        <w:gridCol w:w="2335"/>
+        <w:gridCol w:w="7015"/>
+      </w:tblGrid>
+      <w:tr>
+        <w:tc>
+          <w:tcPr>
+            <w:tcW w:w="2335" w:type="dxa"/>
+          </w:tcPr>
+          <w:p>
+            <w:pPr>
+              <w:rPr>
+                <w:rFonts w:ascii="Times New Roman" w:eastAsia="Times New Roman" w:hAnsi="Times New Roman" w:cs="Times New Roman"/>
+                <w:color w:val="000000"/>
+                <w:kern w:val="0"/>
+                <w14:ligatures w14:val="none"/>
+              </w:rPr>
+            </w:pPr>
+            <w:r>
+              <w:rPr>
+                <w:rFonts w:ascii="Times New Roman" w:eastAsia="Times New Roman" w:hAnsi="Times New Roman" w:cs="Times New Roman"/>
+                <w:color w:val="000000"/>
+                <w:kern w:val="0"/>
+                <w14:ligatures w14:val="none"/>
+              </w:rPr>
+              <w:t>Name</w:t>
+            </w:r>
+          </w:p>
+        </w:tc>
+        <w:tc>
+          <w:tcPr>
+            <w:tcW w:w="7015" w:type="dxa"/>
+          </w:tcPr>
+          <w:p>
+            <w:pPr>
+              <w:rPr>
+                <w:rFonts w:ascii="Times New Roman" w:eastAsia="Times New Roman" w:hAnsi="Times New Roman" w:cs="Times New Roman"/>
+                <w:color w:val="000000"/>
+                <w:kern w:val="0"/>
+                <w14:ligatures w14:val="none"/>
+              </w:rPr>
+            </w:pPr>
+            <w:r>
+              <w:rPr>
+                <w:rFonts w:ascii="Times New Roman" w:eastAsia="Times New Roman" w:hAnsi="Times New Roman" w:cs="Times New Roman"/>
+                <w:color w:val="000000"/>
+                <w:kern w:val="0"/>
+                <w14:ligatures w14:val="none"/>
+              </w:rPr>
+              <w:t>Description</w:t>
+            </w:r>
+          </w:p>
+        </w:tc>
+      </w:tr>
+      <w:tr>
+        <w:tc>
+          <w:tcPr>
+            <w:tcW w:w="2335" w:type="dxa"/>
+          </w:tcPr>
+          <w:p>
+            <w:pPr>
+              <w:rPr>
+                <w:rFonts w:ascii="Times New Roman" w:eastAsia="Times New Roman" w:hAnsi="Times New Roman" w:cs="Times New Roman"/>
+                <w:color w:val="000000"/>
+                <w:kern w:val="0"/>
+                <w14:ligatures w14:val="none"/>
+              </w:rPr>
+            </w:pPr>
+            <w:r>
+              <w:rPr>
+                <w:rFonts w:ascii="Times New Roman" w:eastAsia="Times New Roman" w:hAnsi="Times New Roman" w:cs="Times New Roman"/>
+                <w:color w:val="000000"/>
+                <w:kern w:val="0"/>
+                <w14:ligatures w14:val="none"/>
+              </w:rPr>
+              <w:t>Time</w:t>
+            </w:r>
+          </w:p>
+        </w:tc>
+        <w:tc>
+          <w:tcPr>
+            <w:tcW w:w="7015" w:type="dxa"/>
+          </w:tcPr>
+          <w:p>
+            <w:pPr>
+              <w:rPr>
+                <w:rFonts w:ascii="Times New Roman" w:eastAsia="Times New Roman" w:hAnsi="Times New Roman" w:cs="Times New Roman"/>
+                <w:color w:val="000000"/>
+                <w:kern w:val="0"/>
+                <w14:ligatures w14:val="none"/>
+              </w:rPr>
+            </w:pPr>
+            <w:r>
+              <w:rPr>
+                <w:rFonts w:ascii="Times New Roman" w:eastAsia="Times New Roman" w:hAnsi="Times New Roman" w:cs="Times New Roman"/>
+                <w:color w:val="000000"/>
+                <w:kern w:val="0"/>
+                <w14:ligatures w14:val="none"/>
+              </w:rPr>
+              <w:t>Month date, first of each month</w:t>
+            </w:r>
+          </w:p>
+        </w:tc>
+      </w:tr>
+      <w:tr>
+        <w:tc>
+          <w:tcPr>
+            <w:tcW w:w="2335" w:type="dxa"/>
+          </w:tcPr>
+          <w:p>
+            <w:pPr>
+              <w:rPr>
+                <w:rFonts w:ascii="Times New Roman" w:eastAsia="Times New Roman" w:hAnsi="Times New Roman" w:cs="Times New Roman"/>
+                <w:color w:val="000000"/>
+                <w:kern w:val="0"/>
+                <w14:ligatures w14:val="none"/>
+              </w:rPr>
+            </w:pPr>
+            <w:r>
+              <w:rPr>
+                <w:rFonts w:ascii="Times New Roman" w:eastAsia="Times New Roman" w:hAnsi="Times New Roman" w:cs="Times New Roman"/>
+                <w:color w:val="000000"/>
+                <w:kern w:val="0"/>
+                <w14:ligatures w14:val="none"/>
+              </w:rPr>
+              <w:t xml:space="preserve">AI </w:t>
+            </w:r>
+            <w:r>
+              <w:rPr>
+                <w:rFonts w:ascii="Times New Roman" w:eastAsia="Times New Roman" w:hAnsi="Times New Roman" w:cs="Times New Roman"/>
+                <w:color w:val="000000"/>
+                <w:kern w:val="0"/>
+                <w14:ligatures w14:val="none"/>
+              </w:rPr>
+              <w:t>Searches</w:t>
+            </w:r>
           </w:p>
         </w:tc>
         <w:tc>

</xml_diff>